<commit_message>
zip file added and report updated
</commit_message>
<xml_diff>
--- a/Take-Home-Assignment/Report/Take-Home-Assignment-Report-Kornidesz-Platakis.docx
+++ b/Take-Home-Assignment/Report/Take-Home-Assignment-Report-Kornidesz-Platakis.docx
@@ -830,6 +830,7 @@
       <w:r>
         <w:rPr>
           <w:rFonts w:ascii="Times New Roman" w:hAnsi="Times New Roman" w:cs="Times New Roman"/>
+          <w:noProof/>
         </w:rPr>
         <w:lastRenderedPageBreak/>
         <w:drawing>
@@ -1011,13 +1012,7 @@
         <w:rPr>
           <w:rFonts w:ascii="Times New Roman" w:hAnsi="Times New Roman" w:cs="Times New Roman"/>
         </w:rPr>
-        <w:t>are used to extract contours</w:t>
-      </w:r>
-      <w:r>
-        <w:rPr>
-          <w:rFonts w:ascii="Times New Roman" w:hAnsi="Times New Roman" w:cs="Times New Roman"/>
-        </w:rPr>
-        <w:t xml:space="preserve">, </w:t>
+        <w:t xml:space="preserve">are used to extract contours, </w:t>
       </w:r>
       <w:r>
         <w:rPr>
@@ -1185,13 +1180,7 @@
         <w:rPr>
           <w:rFonts w:ascii="Times New Roman" w:hAnsi="Times New Roman" w:cs="Times New Roman"/>
         </w:rPr>
-        <w:t>An</w:t>
-      </w:r>
-      <w:r>
-        <w:rPr>
-          <w:rFonts w:ascii="Times New Roman" w:hAnsi="Times New Roman" w:cs="Times New Roman"/>
-        </w:rPr>
-        <w:t xml:space="preserve"> </w:t>
+        <w:t xml:space="preserve">An </w:t>
       </w:r>
       <w:r>
         <w:rPr>
@@ -1302,97 +1291,7 @@
         <w:rPr>
           <w:rFonts w:ascii="Times New Roman" w:hAnsi="Times New Roman" w:cs="Times New Roman"/>
         </w:rPr>
-        <w:t>By supporting</w:t>
-      </w:r>
-      <w:r>
-        <w:rPr>
-          <w:rFonts w:ascii="Times New Roman" w:hAnsi="Times New Roman" w:cs="Times New Roman"/>
-        </w:rPr>
-        <w:t xml:space="preserve"> predefined shapes (cube, cuboid, sphere, pyramid, pentagonal prism), the system classifies contours based on</w:t>
-      </w:r>
-      <w:r>
-        <w:rPr>
-          <w:rFonts w:ascii="Times New Roman" w:hAnsi="Times New Roman" w:cs="Times New Roman"/>
-        </w:rPr>
-        <w:t xml:space="preserve"> the drawn</w:t>
-      </w:r>
-      <w:r>
-        <w:rPr>
-          <w:rFonts w:ascii="Times New Roman" w:hAnsi="Times New Roman" w:cs="Times New Roman"/>
-        </w:rPr>
-        <w:t xml:space="preserve"> polygon</w:t>
-      </w:r>
-      <w:r>
-        <w:rPr>
-          <w:rFonts w:ascii="Times New Roman" w:hAnsi="Times New Roman" w:cs="Times New Roman"/>
-        </w:rPr>
-        <w:t>’s</w:t>
-      </w:r>
-      <w:r>
-        <w:rPr>
-          <w:rFonts w:ascii="Times New Roman" w:hAnsi="Times New Roman" w:cs="Times New Roman"/>
-        </w:rPr>
-        <w:t xml:space="preserve"> vertex count, aspect ratios, and circularity</w:t>
-      </w:r>
-      <w:r>
-        <w:rPr>
-          <w:rFonts w:ascii="Times New Roman" w:hAnsi="Times New Roman" w:cs="Times New Roman"/>
-        </w:rPr>
-        <w:t xml:space="preserve"> measure</w:t>
-      </w:r>
-      <w:r>
-        <w:rPr>
-          <w:rFonts w:ascii="Times New Roman" w:hAnsi="Times New Roman" w:cs="Times New Roman"/>
-        </w:rPr>
-        <w:t xml:space="preserve">. </w:t>
-      </w:r>
-      <w:r>
-        <w:rPr>
-          <w:rFonts w:ascii="Times New Roman" w:hAnsi="Times New Roman" w:cs="Times New Roman"/>
-        </w:rPr>
-        <w:t>Based</w:t>
-      </w:r>
-      <w:r>
-        <w:rPr>
-          <w:rFonts w:ascii="Times New Roman" w:hAnsi="Times New Roman" w:cs="Times New Roman"/>
-        </w:rPr>
-        <w:t xml:space="preserve"> on the classification</w:t>
-      </w:r>
-      <w:r>
-        <w:rPr>
-          <w:rFonts w:ascii="Times New Roman" w:hAnsi="Times New Roman" w:cs="Times New Roman"/>
-        </w:rPr>
-        <w:t xml:space="preserve"> (can classify: square, rectangle, circle, triangle, pentagon)</w:t>
-      </w:r>
-      <w:r>
-        <w:rPr>
-          <w:rFonts w:ascii="Times New Roman" w:hAnsi="Times New Roman" w:cs="Times New Roman"/>
-        </w:rPr>
-        <w:t xml:space="preserve">, a corresponding pre‑generated mesh is </w:t>
-      </w:r>
-      <w:r>
-        <w:rPr>
-          <w:rFonts w:ascii="Times New Roman" w:hAnsi="Times New Roman" w:cs="Times New Roman"/>
-        </w:rPr>
-        <w:t>inserted</w:t>
-      </w:r>
-      <w:r>
-        <w:rPr>
-          <w:rFonts w:ascii="Times New Roman" w:hAnsi="Times New Roman" w:cs="Times New Roman"/>
-        </w:rPr>
-        <w:t xml:space="preserve"> in</w:t>
-      </w:r>
-      <w:r>
-        <w:rPr>
-          <w:rFonts w:ascii="Times New Roman" w:hAnsi="Times New Roman" w:cs="Times New Roman"/>
-        </w:rPr>
-        <w:t>to</w:t>
-      </w:r>
-      <w:r>
-        <w:rPr>
-          <w:rFonts w:ascii="Times New Roman" w:hAnsi="Times New Roman" w:cs="Times New Roman"/>
-        </w:rPr>
-        <w:t xml:space="preserve"> the 3D scene.</w:t>
+        <w:t>By supporting predefined shapes (cube, cuboid, sphere, pyramid, pentagonal prism), the system classifies contours based on the drawn polygon’s vertex count, aspect ratios, and circularity measure. Based on the classification (can classify: square, rectangle, circle, triangle, pentagon), a corresponding pre‑generated mesh is inserted into the 3D scene.</w:t>
       </w:r>
       <w:r>
         <w:rPr>
@@ -1404,13 +1303,7 @@
         <w:rPr>
           <w:rFonts w:ascii="Times New Roman" w:hAnsi="Times New Roman" w:cs="Times New Roman"/>
         </w:rPr>
-        <w:t xml:space="preserve"> </w:t>
-      </w:r>
-      <w:r>
-        <w:rPr>
-          <w:rFonts w:ascii="Times New Roman" w:hAnsi="Times New Roman" w:cs="Times New Roman"/>
-        </w:rPr>
-        <w:t>(2D window is in focus).</w:t>
+        <w:t xml:space="preserve"> (2D window is in focus).</w:t>
       </w:r>
     </w:p>
     <w:p>
@@ -1422,6 +1315,7 @@
       <w:r>
         <w:rPr>
           <w:rFonts w:ascii="Times New Roman" w:hAnsi="Times New Roman" w:cs="Times New Roman"/>
+          <w:noProof/>
         </w:rPr>
         <w:lastRenderedPageBreak/>
         <w:drawing>
@@ -1511,73 +1405,7 @@
         <w:rPr>
           <w:rFonts w:ascii="Times New Roman" w:hAnsi="Times New Roman" w:cs="Times New Roman"/>
         </w:rPr>
-        <w:t>The e</w:t>
-      </w:r>
-      <w:r>
-        <w:rPr>
-          <w:rFonts w:ascii="Times New Roman" w:hAnsi="Times New Roman" w:cs="Times New Roman"/>
-        </w:rPr>
-        <w:t xml:space="preserve">xtrusion </w:t>
-      </w:r>
-      <w:r>
-        <w:rPr>
-          <w:rFonts w:ascii="Times New Roman" w:hAnsi="Times New Roman" w:cs="Times New Roman"/>
-        </w:rPr>
-        <w:t xml:space="preserve">algorithm </w:t>
-      </w:r>
-      <w:r>
-        <w:rPr>
-          <w:rFonts w:ascii="Times New Roman" w:hAnsi="Times New Roman" w:cs="Times New Roman"/>
-        </w:rPr>
-        <w:t xml:space="preserve">transforms a 2D polygon into a 3D prism by creating </w:t>
-      </w:r>
-      <w:r>
-        <w:rPr>
-          <w:rFonts w:ascii="Times New Roman" w:hAnsi="Times New Roman" w:cs="Times New Roman"/>
-        </w:rPr>
-        <w:t>another parallel</w:t>
-      </w:r>
-      <w:r>
-        <w:rPr>
-          <w:rFonts w:ascii="Times New Roman" w:hAnsi="Times New Roman" w:cs="Times New Roman"/>
-        </w:rPr>
-        <w:t xml:space="preserve"> cop</w:t>
-      </w:r>
-      <w:r>
-        <w:rPr>
-          <w:rFonts w:ascii="Times New Roman" w:hAnsi="Times New Roman" w:cs="Times New Roman"/>
-        </w:rPr>
-        <w:t>y</w:t>
-      </w:r>
-      <w:r>
-        <w:rPr>
-          <w:rFonts w:ascii="Times New Roman" w:hAnsi="Times New Roman" w:cs="Times New Roman"/>
-        </w:rPr>
-        <w:t xml:space="preserve"> of the polygon </w:t>
-      </w:r>
-      <w:r>
-        <w:rPr>
-          <w:rFonts w:ascii="Times New Roman" w:hAnsi="Times New Roman" w:cs="Times New Roman"/>
-        </w:rPr>
-        <w:t xml:space="preserve">from the original polygon in a predefined distance using the y axis </w:t>
-      </w:r>
-      <w:r>
-        <w:rPr>
-          <w:rFonts w:ascii="Times New Roman" w:hAnsi="Times New Roman" w:cs="Times New Roman"/>
-        </w:rPr>
-        <w:t>and connect</w:t>
-      </w:r>
-      <w:r>
-        <w:rPr>
-          <w:rFonts w:ascii="Times New Roman" w:hAnsi="Times New Roman" w:cs="Times New Roman"/>
-        </w:rPr>
-        <w:t>s</w:t>
-      </w:r>
-      <w:r>
-        <w:rPr>
-          <w:rFonts w:ascii="Times New Roman" w:hAnsi="Times New Roman" w:cs="Times New Roman"/>
-        </w:rPr>
-        <w:t xml:space="preserve"> them with faces. The implementation performs the following steps:</w:t>
+        <w:t>The extrusion algorithm transforms a 2D polygon into a 3D prism by creating another parallel copy of the polygon from the original polygon in a predefined distance using the y axis and connects them with faces. The implementation performs the following steps:</w:t>
       </w:r>
     </w:p>
     <w:p>
@@ -1722,6 +1550,7 @@
       <w:r>
         <w:rPr>
           <w:rFonts w:ascii="Times New Roman" w:hAnsi="Times New Roman" w:cs="Times New Roman"/>
+          <w:noProof/>
         </w:rPr>
         <w:drawing>
           <wp:inline distT="0" distB="0" distL="0" distR="0" wp14:anchorId="284CC235" wp14:editId="1C801885">
@@ -2018,13 +1847,7 @@
         <w:rPr>
           <w:rFonts w:ascii="Times New Roman" w:hAnsi="Times New Roman" w:cs="Times New Roman"/>
         </w:rPr>
-        <w:t xml:space="preserve"> </w:t>
-      </w:r>
-      <w:r>
-        <w:rPr>
-          <w:rFonts w:ascii="Times New Roman" w:hAnsi="Times New Roman" w:cs="Times New Roman"/>
-        </w:rPr>
-        <w:t>(2D window is in focus).</w:t>
+        <w:t xml:space="preserve"> (2D window is in focus).</w:t>
       </w:r>
     </w:p>
     <w:p>
@@ -2036,6 +1859,7 @@
       <w:r>
         <w:rPr>
           <w:rFonts w:ascii="Times New Roman" w:hAnsi="Times New Roman" w:cs="Times New Roman"/>
+          <w:noProof/>
         </w:rPr>
         <w:drawing>
           <wp:inline distT="0" distB="0" distL="0" distR="0" wp14:anchorId="75FC984A" wp14:editId="71022180">
@@ -2310,25 +2134,7 @@
         <w:rPr>
           <w:rFonts w:ascii="Times New Roman" w:hAnsi="Times New Roman" w:cs="Times New Roman"/>
         </w:rPr>
-        <w:t>When the</w:t>
-      </w:r>
-      <w:r>
-        <w:rPr>
-          <w:rFonts w:ascii="Times New Roman" w:hAnsi="Times New Roman" w:cs="Times New Roman"/>
-        </w:rPr>
-        <w:t xml:space="preserve"> 3D window</w:t>
-      </w:r>
-      <w:r>
-        <w:rPr>
-          <w:rFonts w:ascii="Times New Roman" w:hAnsi="Times New Roman" w:cs="Times New Roman"/>
-        </w:rPr>
-        <w:t xml:space="preserve"> has the focus</w:t>
-      </w:r>
-      <w:r>
-        <w:rPr>
-          <w:rFonts w:ascii="Times New Roman" w:hAnsi="Times New Roman" w:cs="Times New Roman"/>
-        </w:rPr>
-        <w:t xml:space="preserve">, users can </w:t>
+        <w:t xml:space="preserve">When the 3D window has the focus, users can </w:t>
       </w:r>
       <w:r>
         <w:rPr>
@@ -2467,13 +2273,7 @@
         <w:rPr>
           <w:rFonts w:ascii="Times New Roman" w:hAnsi="Times New Roman" w:cs="Times New Roman"/>
         </w:rPr>
-        <w:t xml:space="preserve"> </w:t>
-      </w:r>
-      <w:r>
-        <w:rPr>
-          <w:rFonts w:ascii="Times New Roman" w:hAnsi="Times New Roman" w:cs="Times New Roman"/>
-        </w:rPr>
-        <w:t>Moving in the 3D space is possible by holding the right mouse button and using the “ASDW” for moving in the classical way. By pressing the “E” and “Q” keys while holding the right mouse button the use can move up and down straight. When moving forward and backward the mouse placed cursor alters the movement’s direction into the direction of the ray (where the user faces in the 3D space).</w:t>
+        <w:t xml:space="preserve"> Moving in the 3D space is possible by holding the right mouse button and using the “ASDW” for moving in the classical way. By pressing the “E” and “Q” keys while holding the right mouse button the use can move up and down straight. When moving forward and backward the mouse placed cursor alters the movement’s direction into the direction of the ray (where the user faces in the 3D space).</w:t>
       </w:r>
     </w:p>
     <w:p>
@@ -2643,6 +2443,7 @@
       <w:r>
         <w:rPr>
           <w:rFonts w:ascii="Times New Roman" w:hAnsi="Times New Roman" w:cs="Times New Roman"/>
+          <w:noProof/>
         </w:rPr>
         <w:drawing>
           <wp:inline distT="0" distB="0" distL="0" distR="0" wp14:anchorId="616319DD" wp14:editId="35597637">
@@ -2699,6 +2500,7 @@
       <w:r>
         <w:rPr>
           <w:rFonts w:ascii="Times New Roman" w:hAnsi="Times New Roman" w:cs="Times New Roman"/>
+          <w:noProof/>
         </w:rPr>
         <w:drawing>
           <wp:inline distT="0" distB="0" distL="0" distR="0" wp14:anchorId="4190423C" wp14:editId="4418FD2A">
@@ -3151,12 +2953,6 @@
         <w:gridCol w:w="4063"/>
       </w:tblGrid>
       <w:tr>
-        <w:tblPrEx>
-          <w:tblCellMar>
-            <w:top w:w="0" w:type="dxa"/>
-            <w:bottom w:w="0" w:type="dxa"/>
-          </w:tblCellMar>
-        </w:tblPrEx>
         <w:trPr>
           <w:trHeight w:val="110"/>
           <w:jc w:val="center"/>
@@ -3219,12 +3015,6 @@
         </w:tc>
       </w:tr>
       <w:tr>
-        <w:tblPrEx>
-          <w:tblCellMar>
-            <w:top w:w="0" w:type="dxa"/>
-            <w:bottom w:w="0" w:type="dxa"/>
-          </w:tblCellMar>
-        </w:tblPrEx>
         <w:trPr>
           <w:trHeight w:val="110"/>
           <w:jc w:val="center"/>
@@ -3281,12 +3071,6 @@
         </w:tc>
       </w:tr>
       <w:tr>
-        <w:tblPrEx>
-          <w:tblCellMar>
-            <w:top w:w="0" w:type="dxa"/>
-            <w:bottom w:w="0" w:type="dxa"/>
-          </w:tblCellMar>
-        </w:tblPrEx>
         <w:trPr>
           <w:trHeight w:val="110"/>
           <w:jc w:val="center"/>
@@ -3343,12 +3127,6 @@
         </w:tc>
       </w:tr>
       <w:tr>
-        <w:tblPrEx>
-          <w:tblCellMar>
-            <w:top w:w="0" w:type="dxa"/>
-            <w:bottom w:w="0" w:type="dxa"/>
-          </w:tblCellMar>
-        </w:tblPrEx>
         <w:trPr>
           <w:trHeight w:val="244"/>
           <w:jc w:val="center"/>
@@ -3486,6 +3264,7 @@
       <w:r>
         <w:rPr>
           <w:rFonts w:ascii="Times New Roman" w:hAnsi="Times New Roman" w:cs="Times New Roman"/>
+          <w:noProof/>
         </w:rPr>
         <w:drawing>
           <wp:inline distT="0" distB="0" distL="0" distR="0" wp14:anchorId="12FB4D6D" wp14:editId="35F1EF3C">
@@ -3549,6 +3328,7 @@
       <w:r>
         <w:rPr>
           <w:rFonts w:ascii="Times New Roman" w:hAnsi="Times New Roman" w:cs="Times New Roman"/>
+          <w:noProof/>
         </w:rPr>
         <w:lastRenderedPageBreak/>
         <w:drawing>
@@ -3590,6 +3370,7 @@
       <w:r>
         <w:rPr>
           <w:rFonts w:ascii="Times New Roman" w:hAnsi="Times New Roman" w:cs="Times New Roman"/>
+          <w:noProof/>
         </w:rPr>
         <w:drawing>
           <wp:inline distT="0" distB="0" distL="0" distR="0" wp14:anchorId="0CE4050F" wp14:editId="1D4809AC">
@@ -3766,6 +3547,7 @@
       <w:r>
         <w:rPr>
           <w:rFonts w:ascii="Times New Roman" w:hAnsi="Times New Roman" w:cs="Times New Roman"/>
+          <w:noProof/>
         </w:rPr>
         <w:drawing>
           <wp:inline distT="0" distB="0" distL="0" distR="0" wp14:anchorId="50C0EA6C" wp14:editId="1D73979B">
@@ -4044,13 +3826,7 @@
         <w:rPr>
           <w:rFonts w:ascii="Times New Roman" w:hAnsi="Times New Roman" w:cs="Times New Roman"/>
         </w:rPr>
-        <w:t>S</w:t>
-      </w:r>
-      <w:r>
-        <w:rPr>
-          <w:rFonts w:ascii="Times New Roman" w:hAnsi="Times New Roman" w:cs="Times New Roman"/>
-        </w:rPr>
-        <w:t>hape recognition</w:t>
+        <w:t>Shape recognition</w:t>
       </w:r>
     </w:p>
     <w:p>
@@ -4098,19 +3874,7 @@
         <w:rPr>
           <w:rFonts w:ascii="Times New Roman" w:hAnsi="Times New Roman" w:cs="Times New Roman"/>
         </w:rPr>
-        <w:t>D</w:t>
-      </w:r>
-      <w:r>
-        <w:rPr>
-          <w:rFonts w:ascii="Times New Roman" w:hAnsi="Times New Roman" w:cs="Times New Roman"/>
-        </w:rPr>
-        <w:t>irect manipulation of objects</w:t>
-      </w:r>
-      <w:r>
-        <w:rPr>
-          <w:rFonts w:ascii="Times New Roman" w:hAnsi="Times New Roman" w:cs="Times New Roman"/>
-        </w:rPr>
-        <w:t xml:space="preserve"> with </w:t>
+        <w:t xml:space="preserve">Direct manipulation of objects with </w:t>
       </w:r>
       <w:r>
         <w:rPr>
@@ -4147,19 +3911,7 @@
         <w:rPr>
           <w:rFonts w:ascii="Times New Roman" w:hAnsi="Times New Roman" w:cs="Times New Roman"/>
         </w:rPr>
-        <w:t>The system’s l</w:t>
-      </w:r>
-      <w:r>
-        <w:rPr>
-          <w:rFonts w:ascii="Times New Roman" w:hAnsi="Times New Roman" w:cs="Times New Roman"/>
-        </w:rPr>
-        <w:t xml:space="preserve">imitations </w:t>
-      </w:r>
-      <w:r>
-        <w:rPr>
-          <w:rFonts w:ascii="Times New Roman" w:hAnsi="Times New Roman" w:cs="Times New Roman"/>
-        </w:rPr>
-        <w:t>are:</w:t>
+        <w:t>The system’s limitations are:</w:t>
       </w:r>
     </w:p>
     <w:p>
@@ -4177,13 +3929,7 @@
         <w:rPr>
           <w:rFonts w:ascii="Times New Roman" w:hAnsi="Times New Roman" w:cs="Times New Roman"/>
         </w:rPr>
-        <w:t>S</w:t>
-      </w:r>
-      <w:r>
-        <w:rPr>
-          <w:rFonts w:ascii="Times New Roman" w:hAnsi="Times New Roman" w:cs="Times New Roman"/>
-        </w:rPr>
-        <w:t>ensitivity to noisy sketches</w:t>
+        <w:t>Sensitivity to noisy sketches</w:t>
       </w:r>
     </w:p>
     <w:p>
@@ -4201,13 +3947,7 @@
         <w:rPr>
           <w:rFonts w:ascii="Times New Roman" w:hAnsi="Times New Roman" w:cs="Times New Roman"/>
         </w:rPr>
-        <w:t>L</w:t>
-      </w:r>
-      <w:r>
-        <w:rPr>
-          <w:rFonts w:ascii="Times New Roman" w:hAnsi="Times New Roman" w:cs="Times New Roman"/>
-        </w:rPr>
-        <w:t>ack of smoothing for raw strokes</w:t>
+        <w:t>Lack of smoothing for raw strokes</w:t>
       </w:r>
     </w:p>
     <w:p>
@@ -4225,13 +3965,7 @@
         <w:rPr>
           <w:rFonts w:ascii="Times New Roman" w:hAnsi="Times New Roman" w:cs="Times New Roman"/>
         </w:rPr>
-        <w:t>A</w:t>
-      </w:r>
-      <w:r>
-        <w:rPr>
-          <w:rFonts w:ascii="Times New Roman" w:hAnsi="Times New Roman" w:cs="Times New Roman"/>
-        </w:rPr>
-        <w:t>bsence of mesh optimization</w:t>
+        <w:t>Absence of mesh optimization</w:t>
       </w:r>
     </w:p>
     <w:p>
@@ -4569,25 +4303,38 @@
         <w:rPr>
           <w:rFonts w:ascii="Times New Roman" w:hAnsi="Times New Roman" w:cs="Times New Roman"/>
         </w:rPr>
-        <w:t xml:space="preserve"> object creation, connection of 2D window with 3D window, report writing, survey conduction (Group 1), qualitative analysis - </w:t>
-      </w:r>
-      <w:r>
-        <w:rPr>
-          <w:rFonts w:ascii="Times New Roman" w:hAnsi="Times New Roman" w:cs="Times New Roman"/>
-        </w:rPr>
-        <w:t xml:space="preserve"># of </w:t>
-      </w:r>
-      <w:r>
-        <w:rPr>
-          <w:rFonts w:ascii="Times New Roman" w:hAnsi="Times New Roman" w:cs="Times New Roman"/>
-        </w:rPr>
-        <w:t xml:space="preserve">objects </w:t>
-      </w:r>
-      <w:r>
-        <w:rPr>
-          <w:rFonts w:ascii="Times New Roman" w:hAnsi="Times New Roman" w:cs="Times New Roman"/>
-        </w:rPr>
-        <w:t>vs FPS</w:t>
+        <w:t xml:space="preserve"> object creation, connection of 2D window with 3D window, report writing, survey conduction (Group 1), qualitative analysis - # of objects vs FPS</w:t>
+      </w:r>
+    </w:p>
+    <w:p>
+      <w:pPr>
+        <w:pStyle w:val="Cmsor2"/>
+      </w:pPr>
+      <w:r>
+        <w:t>GitHub &amp; Google Drive</w:t>
+      </w:r>
+    </w:p>
+    <w:p>
+      <w:hyperlink r:id="rId16" w:history="1">
+        <w:r>
+          <w:rPr>
+            <w:rStyle w:val="Hiperhivatkozs"/>
+          </w:rPr>
+          <w:t>https://github.com/Kornimate/visual-computing-au</w:t>
+        </w:r>
+      </w:hyperlink>
+    </w:p>
+    <w:p>
+      <w:hyperlink r:id="rId17" w:history="1">
+        <w:r>
+          <w:rPr>
+            <w:rStyle w:val="Hiperhivatkozs"/>
+          </w:rPr>
+          <w:t>https://drive.google.com/drive/folders/110derdyVaWzRYPp3GeGZmyjPLwbqNPl6?usp=drive_link</w:t>
+        </w:r>
+      </w:hyperlink>
+      <w:r>
+        <w:t xml:space="preserve"> </w:t>
       </w:r>
     </w:p>
     <w:sectPr>
@@ -6584,6 +6331,7 @@
   <w:style w:type="character" w:default="1" w:styleId="Bekezdsalapbettpusa">
     <w:name w:val="Default Paragraph Font"/>
     <w:uiPriority w:val="1"/>
+    <w:semiHidden/>
     <w:unhideWhenUsed/>
   </w:style>
   <w:style w:type="table" w:default="1" w:styleId="Normltblzat">
@@ -17388,6 +17136,29 @@
       <w:lang w:val="en-GB"/>
     </w:rPr>
   </w:style>
+  <w:style w:type="character" w:styleId="Hiperhivatkozs">
+    <w:name w:val="Hyperlink"/>
+    <w:basedOn w:val="Bekezdsalapbettpusa"/>
+    <w:uiPriority w:val="99"/>
+    <w:unhideWhenUsed/>
+    <w:rsid w:val="00536A32"/>
+    <w:rPr>
+      <w:color w:val="0000FF" w:themeColor="hyperlink"/>
+      <w:u w:val="single"/>
+    </w:rPr>
+  </w:style>
+  <w:style w:type="character" w:styleId="Feloldatlanmegemlts">
+    <w:name w:val="Unresolved Mention"/>
+    <w:basedOn w:val="Bekezdsalapbettpusa"/>
+    <w:uiPriority w:val="99"/>
+    <w:semiHidden/>
+    <w:unhideWhenUsed/>
+    <w:rsid w:val="00536A32"/>
+    <w:rPr>
+      <w:color w:val="605E5C"/>
+      <w:shd w:val="clear" w:color="auto" w:fill="E1DFDD"/>
+    </w:rPr>
+  </w:style>
 </w:styles>
 </file>
 

</xml_diff>